<commit_message>
updated docs for Proposal 2
</commit_message>
<xml_diff>
--- a/Proposal 2 - Kuyog.docx
+++ b/Proposal 2 - Kuyog.docx
@@ -1768,12 +1768,7 @@
                 <w:rFonts w:ascii="Arial" w:cs="Arial" w:eastAsia="Arial" w:hAnsi="Arial"/>
                 <w:rtl w:val="0"/>
               </w:rPr>
-              <w:t xml:space="preserve">Backend &amp; Auth - Firebase Auth, Firestore, Realtime Database </w:t>
-            </w:r>
-            <w:r>
-              <w:rPr>
-                <w:rtl w:val="0"/>
-              </w:rPr>
+              <w:t xml:space="preserve">Backend &amp; Cloud – Supabase Auth, Supabase Database (PostgreSQL), Supabase Realtime, Supabase Edge Functions </w:t>
             </w:r>
           </w:p>
         </w:tc>

</xml_diff>